<commit_message>
edited daksh reg no. in report
</commit_message>
<xml_diff>
--- a/docs/Kinetic_Observatory_Project_Report.docx
+++ b/docs/Kinetic_Observatory_Project_Report.docx
@@ -247,7 +247,23 @@
           <w:rFonts w:ascii="Times New Roman" w:hAnsi="Times New Roman" w:cs="Times New Roman"/>
           <w:color w:val="000000" w:themeColor="text1"/>
         </w:rPr>
-        <w:t xml:space="preserve"> 54              200905428</w:t>
+        <w:t xml:space="preserve"> 54              2</w:t>
+      </w:r>
+      <w:r>
+        <w:rPr>
+          <w:rFonts w:ascii="Times New Roman" w:hAnsi="Times New Roman" w:cs="Times New Roman"/>
+          <w:color w:val="000000" w:themeColor="text1"/>
+        </w:rPr>
+        <w:t>3</w:t>
+      </w:r>
+      <w:bookmarkStart w:id="0" w:name="_GoBack"/>
+      <w:bookmarkEnd w:id="0"/>
+      <w:r>
+        <w:rPr>
+          <w:rFonts w:ascii="Times New Roman" w:hAnsi="Times New Roman" w:cs="Times New Roman"/>
+          <w:color w:val="000000" w:themeColor="text1"/>
+        </w:rPr>
+        <w:t>0905428</w:t>
       </w:r>
     </w:p>
     <w:p>
@@ -753,11 +769,6 @@
         <w:rPr>
           <w:sz w:val="21"/>
         </w:rPr>
-      </w:r>
-      <w:r>
-        <w:rPr>
-          <w:sz w:val="21"/>
-        </w:rPr>
         <w:fldChar w:fldCharType="separate"/>
       </w:r>
     </w:p>
@@ -1205,13 +1216,7 @@
         <w:rPr>
           <w:color w:val="111826"/>
         </w:rPr>
-        <w:t>The platform emphasizes usability and reproducibility through a clean workflow: upload data, run strategy, inspect results, and download CSV trade logs. A dark terminal-style responsive UI improves presentation quality for viva and demonstration. Backend r</w:t>
-      </w:r>
-      <w:r>
-        <w:rPr>
-          <w:color w:val="111826"/>
-        </w:rPr>
-        <w:t>eliability is supported through form validation, deterministic strategy</w:t>
+        <w:t>The platform emphasizes usability and reproducibility through a clean workflow: upload data, run strategy, inspect results, and download CSV trade logs. A dark terminal-style responsive UI improves presentation quality for viva and demonstration. Backend reliability is supported through form validation, deterministic strategy</w:t>
       </w:r>
       <w:r>
         <w:rPr>
@@ -1420,13 +1425,7 @@
         <w:rPr>
           <w:color w:val="111826"/>
         </w:rPr>
-        <w:t>The project demonstrates full-stack web engineering</w:t>
-      </w:r>
-      <w:r>
-        <w:rPr>
-          <w:color w:val="111826"/>
-        </w:rPr>
-        <w:t xml:space="preserve"> fundamentals with domain-specific application in quantitative finance and educational trading analytics.</w:t>
+        <w:t>The project demonstrates full-stack web engineering fundamentals with domain-specific application in quantitative finance and educational trading analytics.</w:t>
       </w:r>
     </w:p>
     <w:p>
@@ -1510,7 +1509,7 @@
           </mc:Choice>
           <mc:Fallback>
             <w:pict>
-              <v:shape w14:anchorId="7B63D935" id="Graphic 3" o:spid="_x0000_s1026" style="position:absolute;margin-left:63.6pt;margin-top:13.85pt;width:468.1pt;height:.1pt;z-index:-15728640;visibility:visible;mso-wrap-style:square;mso-wrap-distance-left:0;mso-wrap-distance-top:0;mso-wrap-distance-right:0;mso-wrap-distance-bottom:0;mso-position-horizontal:absolute;mso-position-horizontal-relative:page;mso-position-vertical:absolute;mso-position-vertical-relative:text;v-text-anchor:top" coordsize="5944870,1270" o:gfxdata="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" path="m,l5944560,e" filled="f" strokecolor="#cad4e1" strokeweight=".6pt">
+              <v:shape w14:anchorId="34E9BEB8" id="Graphic 3" o:spid="_x0000_s1026" style="position:absolute;margin-left:63.6pt;margin-top:13.85pt;width:468.1pt;height:.1pt;z-index:-15728640;visibility:visible;mso-wrap-style:square;mso-wrap-distance-left:0;mso-wrap-distance-top:0;mso-wrap-distance-right:0;mso-wrap-distance-bottom:0;mso-position-horizontal:absolute;mso-position-horizontal-relative:page;mso-position-vertical:absolute;mso-position-vertical-relative:text;v-text-anchor:top" coordsize="5944870,1270" o:gfxdata="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" path="m,l5944560,e" filled="f" strokecolor="#cad4e1" strokeweight=".6pt">
                 <v:path arrowok="t"/>
                 <w10:wrap type="topAndBottom" anchorx="page"/>
               </v:shape>
@@ -2195,7 +2194,7 @@
           </mc:Choice>
           <mc:Fallback>
             <w:pict>
-              <v:shape w14:anchorId="52761EC4" id="Graphic 4" o:spid="_x0000_s1026" style="position:absolute;margin-left:63.6pt;margin-top:17.1pt;width:468.1pt;height:.1pt;z-index:-15728128;visibility:visible;mso-wrap-style:square;mso-wrap-distance-left:0;mso-wrap-distance-top:0;mso-wrap-distance-right:0;mso-wrap-distance-bottom:0;mso-position-horizontal:absolute;mso-position-horizontal-relative:page;mso-position-vertical:absolute;mso-position-vertical-relative:text;v-text-anchor:top" coordsize="5944870,1270" o:gfxdata="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" path="m,l5944560,e" filled="f" strokecolor="#cad4e1" strokeweight=".6pt">
+              <v:shape w14:anchorId="4E8B91C5" id="Graphic 4" o:spid="_x0000_s1026" style="position:absolute;margin-left:63.6pt;margin-top:17.1pt;width:468.1pt;height:.1pt;z-index:-15728128;visibility:visible;mso-wrap-style:square;mso-wrap-distance-left:0;mso-wrap-distance-top:0;mso-wrap-distance-right:0;mso-wrap-distance-bottom:0;mso-position-horizontal:absolute;mso-position-horizontal-relative:page;mso-position-vertical:absolute;mso-position-vertical-relative:text;v-text-anchor:top" coordsize="5944870,1270" o:gfxdata="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" path="m,l5944560,e" filled="f" strokecolor="#cad4e1" strokeweight=".6pt">
                 <v:path arrowok="t"/>
                 <w10:wrap type="topAndBottom" anchorx="page"/>
               </v:shape>
@@ -2274,13 +2273,7 @@
         <w:rPr>
           <w:color w:val="111826"/>
         </w:rPr>
-        <w:t xml:space="preserve"> is a common method for evaluating trading rules on historical data before real-world deployment. Many enterprise platforms are feature-rich but difficult f</w:t>
-      </w:r>
-      <w:r>
-        <w:rPr>
-          <w:color w:val="111826"/>
-        </w:rPr>
-        <w:t xml:space="preserve">or beginners. This project addresses that gap by building a compact, explainable, and reproducible </w:t>
+        <w:t xml:space="preserve"> is a common method for evaluating trading rules on historical data before real-world deployment. Many enterprise platforms are feature-rich but difficult for beginners. This project addresses that gap by building a compact, explainable, and reproducible </w:t>
       </w:r>
       <w:proofErr w:type="spellStart"/>
       <w:r>
@@ -5067,7 +5060,7 @@
           </mc:Choice>
           <mc:Fallback>
             <w:pict>
-              <v:shape w14:anchorId="6556864C" id="Graphic 5" o:spid="_x0000_s1026" style="position:absolute;margin-left:63.6pt;margin-top:13.9pt;width:468.1pt;height:.1pt;z-index:-15727616;visibility:visible;mso-wrap-style:square;mso-wrap-distance-left:0;mso-wrap-distance-top:0;mso-wrap-distance-right:0;mso-wrap-distance-bottom:0;mso-position-horizontal:absolute;mso-position-horizontal-relative:page;mso-position-vertical:absolute;mso-position-vertical-relative:text;v-text-anchor:top" coordsize="5944870,1270" o:gfxdata="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" path="m,l5944560,e" filled="f" strokecolor="#cad4e1" strokeweight=".6pt">
+              <v:shape w14:anchorId="18140F78" id="Graphic 5" o:spid="_x0000_s1026" style="position:absolute;margin-left:63.6pt;margin-top:13.9pt;width:468.1pt;height:.1pt;z-index:-15727616;visibility:visible;mso-wrap-style:square;mso-wrap-distance-left:0;mso-wrap-distance-top:0;mso-wrap-distance-right:0;mso-wrap-distance-bottom:0;mso-position-horizontal:absolute;mso-position-horizontal-relative:page;mso-position-vertical:absolute;mso-position-vertical-relative:text;v-text-anchor:top" coordsize="5944870,1270" o:gfxdata="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" path="m,l5944560,e" filled="f" strokecolor="#cad4e1" strokeweight=".6pt">
                 <v:path arrowok="t"/>
                 <w10:wrap type="topAndBottom" anchorx="page"/>
               </v:shape>
@@ -5138,13 +5131,7 @@
         <w:rPr>
           <w:color w:val="111826"/>
         </w:rPr>
-        <w:t>Modern web systems favor modular backend APIs, responsive UI, and test-first reliability. Python/Django remains strong for rapid development due to batteries-included architecture (ORM, forms, admin, routing), while JavaScript-pow</w:t>
-      </w:r>
-      <w:r>
-        <w:rPr>
-          <w:color w:val="111826"/>
-        </w:rPr>
-        <w:t>ered frontends enable interactive experiences.</w:t>
+        <w:t>Modern web systems favor modular backend APIs, responsive UI, and test-first reliability. Python/Django remains strong for rapid development due to batteries-included architecture (ORM, forms, admin, routing), while JavaScript-powered frontends enable interactive experiences.</w:t>
       </w:r>
     </w:p>
     <w:p>
@@ -5462,13 +5449,7 @@
         <w:rPr>
           <w:color w:val="111826"/>
         </w:rPr>
-        <w:t>Em</w:t>
-      </w:r>
-      <w:r>
-        <w:rPr>
-          <w:color w:val="111826"/>
-        </w:rPr>
-        <w:t xml:space="preserve">erging frameworks and </w:t>
+        <w:t xml:space="preserve">Emerging frameworks and </w:t>
       </w:r>
       <w:r>
         <w:rPr>
@@ -6353,14 +6334,7 @@
           <w:color w:val="111826"/>
           <w:sz w:val="21"/>
         </w:rPr>
-        <w:t>Sprea</w:t>
-      </w:r>
-      <w:r>
-        <w:rPr>
-          <w:color w:val="111826"/>
-          <w:sz w:val="21"/>
-        </w:rPr>
-        <w:t>dsheet-only</w:t>
+        <w:t>Spreadsheet-only</w:t>
       </w:r>
       <w:r>
         <w:rPr>
@@ -6966,7 +6940,7 @@
           </mc:Choice>
           <mc:Fallback>
             <w:pict>
-              <v:shape w14:anchorId="6D9097EF" id="Graphic 6" o:spid="_x0000_s1026" style="position:absolute;margin-left:63.6pt;margin-top:17.1pt;width:468.1pt;height:.1pt;z-index:-15727104;visibility:visible;mso-wrap-style:square;mso-wrap-distance-left:0;mso-wrap-distance-top:0;mso-wrap-distance-right:0;mso-wrap-distance-bottom:0;mso-position-horizontal:absolute;mso-position-horizontal-relative:page;mso-position-vertical:absolute;mso-position-vertical-relative:text;v-text-anchor:top" coordsize="5944870,1270" o:gfxdata="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" path="m,l5944560,e" filled="f" strokecolor="#cad4e1" strokeweight=".6pt">
+              <v:shape w14:anchorId="559E528C" id="Graphic 6" o:spid="_x0000_s1026" style="position:absolute;margin-left:63.6pt;margin-top:17.1pt;width:468.1pt;height:.1pt;z-index:-15727104;visibility:visible;mso-wrap-style:square;mso-wrap-distance-left:0;mso-wrap-distance-top:0;mso-wrap-distance-right:0;mso-wrap-distance-bottom:0;mso-position-horizontal:absolute;mso-position-horizontal-relative:page;mso-position-vertical:absolute;mso-position-vertical-relative:text;v-text-anchor:top" coordsize="5944870,1270" o:gfxdata="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" path="m,l5944560,e" filled="f" strokecolor="#cad4e1" strokeweight=".6pt">
                 <v:path arrowok="t"/>
                 <w10:wrap type="topAndBottom" anchorx="page"/>
               </v:shape>
@@ -9816,7 +9790,7 @@
           </mc:Choice>
           <mc:Fallback>
             <w:pict>
-              <v:shape w14:anchorId="0FD21169" id="Graphic 7" o:spid="_x0000_s1026" style="position:absolute;margin-left:63.6pt;margin-top:17.1pt;width:468.1pt;height:.1pt;z-index:-15726592;visibility:visible;mso-wrap-style:square;mso-wrap-distance-left:0;mso-wrap-distance-top:0;mso-wrap-distance-right:0;mso-wrap-distance-bottom:0;mso-position-horizontal:absolute;mso-position-horizontal-relative:page;mso-position-vertical:absolute;mso-position-vertical-relative:text;v-text-anchor:top" coordsize="5944870,1270" o:gfxdata="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" path="m,l5944560,e" filled="f" strokecolor="#cad4e1" strokeweight=".6pt">
+              <v:shape w14:anchorId="78C8BFCD" id="Graphic 7" o:spid="_x0000_s1026" style="position:absolute;margin-left:63.6pt;margin-top:17.1pt;width:468.1pt;height:.1pt;z-index:-15726592;visibility:visible;mso-wrap-style:square;mso-wrap-distance-left:0;mso-wrap-distance-top:0;mso-wrap-distance-right:0;mso-wrap-distance-bottom:0;mso-position-horizontal:absolute;mso-position-horizontal-relative:page;mso-position-vertical:absolute;mso-position-vertical-relative:text;v-text-anchor:top" coordsize="5944870,1270" o:gfxdata="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" path="m,l5944560,e" filled="f" strokecolor="#cad4e1" strokeweight=".6pt">
                 <v:path arrowok="t"/>
                 <w10:wrap type="topAndBottom" anchorx="page"/>
               </v:shape>
@@ -11289,23 +11263,13 @@
                               </w:rPr>
                               <w:t xml:space="preserve"> </w:t>
                             </w:r>
-                            <w:proofErr w:type="spellStart"/>
                             <w:r>
                               <w:rPr>
                                 <w:rFonts w:ascii="Courier New"/>
                                 <w:color w:val="000000"/>
                                 <w:sz w:val="20"/>
                               </w:rPr>
-                              <w:t>UploadedDataset</w:t>
-                            </w:r>
-                            <w:proofErr w:type="spellEnd"/>
-                            <w:r>
-                              <w:rPr>
-                                <w:rFonts w:ascii="Courier New"/>
-                                <w:color w:val="000000"/>
-                                <w:sz w:val="20"/>
-                              </w:rPr>
-                              <w:t xml:space="preserve"> </w:t>
+                              <w:t xml:space="preserve">UploadedDataset </w:t>
                             </w:r>
                             <w:r>
                               <w:rPr>
@@ -11345,7 +11309,6 @@
                               </w:rPr>
                               <w:t xml:space="preserve"> </w:t>
                             </w:r>
-                            <w:proofErr w:type="spellStart"/>
                             <w:r>
                               <w:rPr>
                                 <w:rFonts w:ascii="Courier New"/>
@@ -11354,7 +11317,6 @@
                               </w:rPr>
                               <w:t>Backtest</w:t>
                             </w:r>
-                            <w:proofErr w:type="spellEnd"/>
                             <w:r>
                               <w:rPr>
                                 <w:rFonts w:ascii="Courier New"/>
@@ -11473,7 +11435,6 @@
                               </w:rPr>
                               <w:t xml:space="preserve"> </w:t>
                             </w:r>
-                            <w:proofErr w:type="spellStart"/>
                             <w:r>
                               <w:rPr>
                                 <w:rFonts w:ascii="Courier New"/>
@@ -11482,7 +11443,6 @@
                               </w:rPr>
                               <w:t>BacktestResult</w:t>
                             </w:r>
-                            <w:proofErr w:type="spellEnd"/>
                             <w:r>
                               <w:rPr>
                                 <w:rFonts w:ascii="Courier New"/>
@@ -11862,23 +11822,13 @@
                         </w:rPr>
                         <w:t xml:space="preserve"> </w:t>
                       </w:r>
-                      <w:proofErr w:type="spellStart"/>
                       <w:r>
                         <w:rPr>
                           <w:rFonts w:ascii="Courier New"/>
                           <w:color w:val="000000"/>
                           <w:sz w:val="20"/>
                         </w:rPr>
-                        <w:t>UploadedDataset</w:t>
-                      </w:r>
-                      <w:proofErr w:type="spellEnd"/>
-                      <w:r>
-                        <w:rPr>
-                          <w:rFonts w:ascii="Courier New"/>
-                          <w:color w:val="000000"/>
-                          <w:sz w:val="20"/>
-                        </w:rPr>
-                        <w:t xml:space="preserve"> </w:t>
+                        <w:t xml:space="preserve">UploadedDataset </w:t>
                       </w:r>
                       <w:r>
                         <w:rPr>
@@ -11918,7 +11868,6 @@
                         </w:rPr>
                         <w:t xml:space="preserve"> </w:t>
                       </w:r>
-                      <w:proofErr w:type="spellStart"/>
                       <w:r>
                         <w:rPr>
                           <w:rFonts w:ascii="Courier New"/>
@@ -11927,7 +11876,6 @@
                         </w:rPr>
                         <w:t>Backtest</w:t>
                       </w:r>
-                      <w:proofErr w:type="spellEnd"/>
                       <w:r>
                         <w:rPr>
                           <w:rFonts w:ascii="Courier New"/>
@@ -12046,7 +11994,6 @@
                         </w:rPr>
                         <w:t xml:space="preserve"> </w:t>
                       </w:r>
-                      <w:proofErr w:type="spellStart"/>
                       <w:r>
                         <w:rPr>
                           <w:rFonts w:ascii="Courier New"/>
@@ -12055,7 +12002,6 @@
                         </w:rPr>
                         <w:t>BacktestResult</w:t>
                       </w:r>
-                      <w:proofErr w:type="spellEnd"/>
                       <w:r>
                         <w:rPr>
                           <w:rFonts w:ascii="Courier New"/>
@@ -13425,7 +13371,7 @@
           </mc:Choice>
           <mc:Fallback>
             <w:pict>
-              <v:shape w14:anchorId="7B98DDFC" id="Graphic 9" o:spid="_x0000_s1026" style="position:absolute;margin-left:63.6pt;margin-top:17.1pt;width:468.1pt;height:.1pt;z-index:-15725568;visibility:visible;mso-wrap-style:square;mso-wrap-distance-left:0;mso-wrap-distance-top:0;mso-wrap-distance-right:0;mso-wrap-distance-bottom:0;mso-position-horizontal:absolute;mso-position-horizontal-relative:page;mso-position-vertical:absolute;mso-position-vertical-relative:text;v-text-anchor:top" coordsize="5944870,1270" o:gfxdata="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" path="m,l5944560,e" filled="f" strokecolor="#cad4e1" strokeweight=".6pt">
+              <v:shape w14:anchorId="7B41BC09" id="Graphic 9" o:spid="_x0000_s1026" style="position:absolute;margin-left:63.6pt;margin-top:17.1pt;width:468.1pt;height:.1pt;z-index:-15725568;visibility:visible;mso-wrap-style:square;mso-wrap-distance-left:0;mso-wrap-distance-top:0;mso-wrap-distance-right:0;mso-wrap-distance-bottom:0;mso-position-horizontal:absolute;mso-position-horizontal-relative:page;mso-position-vertical:absolute;mso-position-vertical-relative:text;v-text-anchor:top" coordsize="5944870,1270" o:gfxdata="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" path="m,l5944560,e" filled="f" strokecolor="#cad4e1" strokeweight=".6pt">
                 <v:path arrowok="t"/>
                 <w10:wrap type="topAndBottom" anchorx="page"/>
               </v:shape>
@@ -14384,15 +14330,7 @@
           <w:spacing w:val="-2"/>
           <w:sz w:val="17"/>
         </w:rPr>
-        <w:t>\Scripts\activ</w:t>
-      </w:r>
-      <w:r>
-        <w:rPr>
-          <w:rFonts w:ascii="Courier New"/>
-          <w:spacing w:val="-2"/>
-          <w:sz w:val="17"/>
-        </w:rPr>
-        <w:t>ate.bat</w:t>
+        <w:t>\Scripts\activate.bat</w:t>
       </w:r>
     </w:p>
     <w:p>
@@ -14498,14 +14436,7 @@
           <w:color w:val="111826"/>
           <w:spacing w:val="-2"/>
         </w:rPr>
-        <w:t>macOS/L</w:t>
-      </w:r>
-      <w:r>
-        <w:rPr>
-          <w:color w:val="111826"/>
-          <w:spacing w:val="-2"/>
-        </w:rPr>
-        <w:t>inux:</w:t>
+        <w:t>macOS/Linux:</w:t>
       </w:r>
     </w:p>
     <w:p>
@@ -16107,6 +16038,7 @@
       <w:r>
         <w:rPr>
           <w:rFonts w:ascii="Courier New"/>
+          <w:noProof/>
           <w:sz w:val="20"/>
         </w:rPr>
         <w:drawing>
@@ -16177,6 +16109,7 @@
       <w:r>
         <w:rPr>
           <w:rFonts w:ascii="Courier New"/>
+          <w:noProof/>
           <w:sz w:val="20"/>
         </w:rPr>
         <w:drawing>
@@ -18590,7 +18523,7 @@
           </mc:Choice>
           <mc:Fallback>
             <w:pict>
-              <v:shape w14:anchorId="2DC012B2" id="Graphic 10" o:spid="_x0000_s1026" style="position:absolute;margin-left:63.6pt;margin-top:16.7pt;width:468.1pt;height:.1pt;z-index:-15725056;visibility:visible;mso-wrap-style:square;mso-wrap-distance-left:0;mso-wrap-distance-top:0;mso-wrap-distance-right:0;mso-wrap-distance-bottom:0;mso-position-horizontal:absolute;mso-position-horizontal-relative:page;mso-position-vertical:absolute;mso-position-vertical-relative:text;v-text-anchor:top" coordsize="5944870,1270" o:gfxdata="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" path="m,l5944560,e" filled="f" strokecolor="#cad4e1" strokeweight=".6pt">
+              <v:shape w14:anchorId="62821850" id="Graphic 10" o:spid="_x0000_s1026" style="position:absolute;margin-left:63.6pt;margin-top:16.7pt;width:468.1pt;height:.1pt;z-index:-15725056;visibility:visible;mso-wrap-style:square;mso-wrap-distance-left:0;mso-wrap-distance-top:0;mso-wrap-distance-right:0;mso-wrap-distance-bottom:0;mso-position-horizontal:absolute;mso-position-horizontal-relative:page;mso-position-vertical:absolute;mso-position-vertical-relative:text;v-text-anchor:top" coordsize="5944870,1270" o:gfxdata="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" path="m,l5944560,e" filled="f" strokecolor="#cad4e1" strokeweight=".6pt">
                 <v:path arrowok="t"/>
                 <w10:wrap type="topAndBottom" anchorx="page"/>
               </v:shape>
@@ -19646,7 +19579,7 @@
           </mc:Choice>
           <mc:Fallback>
             <w:pict>
-              <v:shape w14:anchorId="1FAEFF16" id="Graphic 11" o:spid="_x0000_s1026" style="position:absolute;margin-left:63.6pt;margin-top:17.1pt;width:468.1pt;height:.1pt;z-index:-15724544;visibility:visible;mso-wrap-style:square;mso-wrap-distance-left:0;mso-wrap-distance-top:0;mso-wrap-distance-right:0;mso-wrap-distance-bottom:0;mso-position-horizontal:absolute;mso-position-horizontal-relative:page;mso-position-vertical:absolute;mso-position-vertical-relative:text;v-text-anchor:top" coordsize="5944870,1270" o:gfxdata="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" path="m,l5944560,e" filled="f" strokecolor="#cad4e1" strokeweight=".6pt">
+              <v:shape w14:anchorId="24F9CDD3" id="Graphic 11" o:spid="_x0000_s1026" style="position:absolute;margin-left:63.6pt;margin-top:17.1pt;width:468.1pt;height:.1pt;z-index:-15724544;visibility:visible;mso-wrap-style:square;mso-wrap-distance-left:0;mso-wrap-distance-top:0;mso-wrap-distance-right:0;mso-wrap-distance-bottom:0;mso-position-horizontal:absolute;mso-position-horizontal-relative:page;mso-position-vertical:absolute;mso-position-vertical-relative:text;v-text-anchor:top" coordsize="5944870,1270" o:gfxdata="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" path="m,l5944560,e" filled="f" strokecolor="#cad4e1" strokeweight=".6pt">
                 <v:path arrowok="t"/>
                 <w10:wrap type="topAndBottom" anchorx="page"/>
               </v:shape>
@@ -20220,14 +20153,7 @@
           <w:color w:val="111826"/>
           <w:sz w:val="21"/>
         </w:rPr>
-        <w:t>work</w:t>
-      </w:r>
-      <w:r>
-        <w:rPr>
-          <w:color w:val="111826"/>
-          <w:sz w:val="21"/>
-        </w:rPr>
-        <w:t>flow</w:t>
+        <w:t>workflow</w:t>
       </w:r>
       <w:r>
         <w:rPr>
@@ -21505,7 +21431,7 @@
           </mc:Choice>
           <mc:Fallback>
             <w:pict>
-              <v:shape w14:anchorId="34CED32A" id="Graphic 12" o:spid="_x0000_s1026" style="position:absolute;margin-left:63.6pt;margin-top:17.1pt;width:468.1pt;height:.1pt;z-index:-15724032;visibility:visible;mso-wrap-style:square;mso-wrap-distance-left:0;mso-wrap-distance-top:0;mso-wrap-distance-right:0;mso-wrap-distance-bottom:0;mso-position-horizontal:absolute;mso-position-horizontal-relative:page;mso-position-vertical:absolute;mso-position-vertical-relative:text;v-text-anchor:top" coordsize="5944870,1270" o:gfxdata="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" path="m,l5944560,e" filled="f" strokecolor="#cad4e1" strokeweight=".6pt">
+              <v:shape w14:anchorId="434BA19B" id="Graphic 12" o:spid="_x0000_s1026" style="position:absolute;margin-left:63.6pt;margin-top:17.1pt;width:468.1pt;height:.1pt;z-index:-15724032;visibility:visible;mso-wrap-style:square;mso-wrap-distance-left:0;mso-wrap-distance-top:0;mso-wrap-distance-right:0;mso-wrap-distance-bottom:0;mso-position-horizontal:absolute;mso-position-horizontal-relative:page;mso-position-vertical:absolute;mso-position-vertical-relative:text;v-text-anchor:top" coordsize="5944870,1270" o:gfxdata="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" path="m,l5944560,e" filled="f" strokecolor="#cad4e1" strokeweight=".6pt">
                 <v:path arrowok="t"/>
                 <w10:wrap type="topAndBottom" anchorx="page"/>
               </v:shape>
@@ -25052,7 +24978,7 @@
           </mc:Choice>
           <mc:Fallback>
             <w:pict>
-              <v:shape w14:anchorId="0C9C49D3" id="Graphic 21" o:spid="_x0000_s1026" style="position:absolute;margin-left:63.6pt;margin-top:19.75pt;width:468.1pt;height:.1pt;z-index:-15720448;visibility:visible;mso-wrap-style:square;mso-wrap-distance-left:0;mso-wrap-distance-top:0;mso-wrap-distance-right:0;mso-wrap-distance-bottom:0;mso-position-horizontal:absolute;mso-position-horizontal-relative:page;mso-position-vertical:absolute;mso-position-vertical-relative:text;v-text-anchor:top" coordsize="5944870,1270" o:gfxdata="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" path="m,l5944560,e" filled="f" strokecolor="#cad4e1" strokeweight=".6pt">
+              <v:shape w14:anchorId="278F2EA7" id="Graphic 21" o:spid="_x0000_s1026" style="position:absolute;margin-left:63.6pt;margin-top:19.75pt;width:468.1pt;height:.1pt;z-index:-15720448;visibility:visible;mso-wrap-style:square;mso-wrap-distance-left:0;mso-wrap-distance-top:0;mso-wrap-distance-right:0;mso-wrap-distance-bottom:0;mso-position-horizontal:absolute;mso-position-horizontal-relative:page;mso-position-vertical:absolute;mso-position-vertical-relative:text;v-text-anchor:top" coordsize="5944870,1270" o:gfxdata="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" path="m,l5944560,e" filled="f" strokecolor="#cad4e1" strokeweight=".6pt">
                 <v:path arrowok="t"/>
                 <w10:wrap type="topAndBottom" anchorx="page"/>
               </v:shape>
@@ -26762,14 +26688,7 @@
           <w:color w:val="111826"/>
           <w:sz w:val="21"/>
         </w:rPr>
-        <w:t>Educatio</w:t>
-      </w:r>
-      <w:r>
-        <w:rPr>
-          <w:color w:val="111826"/>
-          <w:sz w:val="21"/>
-        </w:rPr>
-        <w:t>nal</w:t>
+        <w:t>Educational</w:t>
       </w:r>
       <w:r>
         <w:rPr>
@@ -27043,7 +26962,7 @@
           </mc:Choice>
           <mc:Fallback>
             <w:pict>
-              <v:shape w14:anchorId="2D8577CA" id="Graphic 22" o:spid="_x0000_s1026" style="position:absolute;margin-left:63.6pt;margin-top:17.1pt;width:468.1pt;height:.1pt;z-index:-15719936;visibility:visible;mso-wrap-style:square;mso-wrap-distance-left:0;mso-wrap-distance-top:0;mso-wrap-distance-right:0;mso-wrap-distance-bottom:0;mso-position-horizontal:absolute;mso-position-horizontal-relative:page;mso-position-vertical:absolute;mso-position-vertical-relative:text;v-text-anchor:top" coordsize="5944870,1270" o:gfxdata="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" path="m,l5944560,e" filled="f" strokecolor="#cad4e1" strokeweight=".6pt">
+              <v:shape w14:anchorId="1663C36F" id="Graphic 22" o:spid="_x0000_s1026" style="position:absolute;margin-left:63.6pt;margin-top:17.1pt;width:468.1pt;height:.1pt;z-index:-15719936;visibility:visible;mso-wrap-style:square;mso-wrap-distance-left:0;mso-wrap-distance-top:0;mso-wrap-distance-right:0;mso-wrap-distance-bottom:0;mso-position-horizontal:absolute;mso-position-horizontal-relative:page;mso-position-vertical:absolute;mso-position-vertical-relative:text;v-text-anchor:top" coordsize="5944870,1270" o:gfxdata="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" path="m,l5944560,e" filled="f" strokecolor="#cad4e1" strokeweight=".6pt">
                 <v:path arrowok="t"/>
                 <w10:wrap type="topAndBottom" anchorx="page"/>
               </v:shape>
@@ -27326,7 +27245,7 @@
           </mc:Choice>
           <mc:Fallback>
             <w:pict>
-              <v:shape w14:anchorId="0894157A" id="Graphic 23" o:spid="_x0000_s1026" style="position:absolute;margin-left:63.6pt;margin-top:13.85pt;width:468.1pt;height:.1pt;z-index:-15719424;visibility:visible;mso-wrap-style:square;mso-wrap-distance-left:0;mso-wrap-distance-top:0;mso-wrap-distance-right:0;mso-wrap-distance-bottom:0;mso-position-horizontal:absolute;mso-position-horizontal-relative:page;mso-position-vertical:absolute;mso-position-vertical-relative:text;v-text-anchor:top" coordsize="5944870,1270" o:gfxdata="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" path="m,l5944560,e" filled="f" strokecolor="#cad4e1" strokeweight=".6pt">
+              <v:shape w14:anchorId="5867A02C" id="Graphic 23" o:spid="_x0000_s1026" style="position:absolute;margin-left:63.6pt;margin-top:13.85pt;width:468.1pt;height:.1pt;z-index:-15719424;visibility:visible;mso-wrap-style:square;mso-wrap-distance-left:0;mso-wrap-distance-top:0;mso-wrap-distance-right:0;mso-wrap-distance-bottom:0;mso-position-horizontal:absolute;mso-position-horizontal-relative:page;mso-position-vertical:absolute;mso-position-vertical-relative:text;v-text-anchor:top" coordsize="5944870,1270" o:gfxdata="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" path="m,l5944560,e" filled="f" strokecolor="#cad4e1" strokeweight=".6pt">
                 <v:path arrowok="t"/>
                 <w10:wrap type="topAndBottom" anchorx="page"/>
               </v:shape>
@@ -27582,14 +27501,7 @@
           <w:color w:val="111826"/>
           <w:sz w:val="21"/>
         </w:rPr>
-        <w:t>I</w:t>
-      </w:r>
-      <w:r>
-        <w:rPr>
-          <w:color w:val="111826"/>
-          <w:sz w:val="21"/>
-        </w:rPr>
-        <w:t>ndex</w:t>
+        <w:t>Index</w:t>
       </w:r>
       <w:r>
         <w:rPr>
@@ -27737,15 +27649,7 @@
             <w:spacing w:val="-2"/>
             <w:sz w:val="21"/>
           </w:rPr>
-          <w:t>https</w:t>
-        </w:r>
-        <w:r>
-          <w:rPr>
-            <w:color w:val="111826"/>
-            <w:spacing w:val="-2"/>
-            <w:sz w:val="21"/>
-          </w:rPr>
-          <w:t>://www.investopedia.com/terms/e/ema.asp</w:t>
+          <w:t>https://www.investopedia.com/terms/e/ema.asp</w:t>
         </w:r>
       </w:hyperlink>
     </w:p>
@@ -28043,7 +27947,7 @@
           </mc:Choice>
           <mc:Fallback>
             <w:pict>
-              <v:shape w14:anchorId="1EDE6313" id="Graphic 24" o:spid="_x0000_s1026" style="position:absolute;margin-left:63.6pt;margin-top:17.1pt;width:468.1pt;height:.1pt;z-index:-15718912;visibility:visible;mso-wrap-style:square;mso-wrap-distance-left:0;mso-wrap-distance-top:0;mso-wrap-distance-right:0;mso-wrap-distance-bottom:0;mso-position-horizontal:absolute;mso-position-horizontal-relative:page;mso-position-vertical:absolute;mso-position-vertical-relative:text;v-text-anchor:top" coordsize="5944870,1270" o:gfxdata="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" path="m,l5944560,e" filled="f" strokecolor="#cad4e1" strokeweight=".6pt">
+              <v:shape w14:anchorId="2C415E35" id="Graphic 24" o:spid="_x0000_s1026" style="position:absolute;margin-left:63.6pt;margin-top:17.1pt;width:468.1pt;height:.1pt;z-index:-15718912;visibility:visible;mso-wrap-style:square;mso-wrap-distance-left:0;mso-wrap-distance-top:0;mso-wrap-distance-right:0;mso-wrap-distance-bottom:0;mso-position-horizontal:absolute;mso-position-horizontal-relative:page;mso-position-vertical:absolute;mso-position-vertical-relative:text;v-text-anchor:top" coordsize="5944870,1270" o:gfxdata="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" path="m,l5944560,e" filled="f" strokecolor="#cad4e1" strokeweight=".6pt">
                 <v:path arrowok="t"/>
                 <w10:wrap type="topAndBottom" anchorx="page"/>
               </v:shape>
@@ -28333,26 +28237,27 @@
           <w:rFonts w:ascii="Courier New"/>
           <w:sz w:val="17"/>
         </w:rPr>
-        <w:t xml:space="preserve"> </w:t>
-      </w:r>
-      <w:bookmarkStart w:id="0" w:name="_GoBack"/>
-      <w:bookmarkEnd w:id="0"/>
+        <w:t xml:space="preserve"> python manage.py test trading python manage.py </w:t>
+      </w:r>
+      <w:proofErr w:type="spellStart"/>
       <w:r>
         <w:rPr>
           <w:rFonts w:ascii="Courier New"/>
           <w:sz w:val="17"/>
         </w:rPr>
-        <w:t xml:space="preserve">python manage.py test trading python manage.py </w:t>
-      </w:r>
-      <w:proofErr w:type="spellStart"/>
-      <w:r>
+        <w:t>runserver</w:t>
+      </w:r>
+      <w:proofErr w:type="spellEnd"/>
+    </w:p>
+    <w:p>
+      <w:pPr>
+        <w:spacing w:before="27" w:line="273" w:lineRule="auto"/>
+        <w:ind w:left="298" w:right="5795"/>
         <w:rPr>
           <w:rFonts w:ascii="Courier New"/>
           <w:sz w:val="17"/>
         </w:rPr>
-        <w:t>runserver</w:t>
-      </w:r>
-      <w:proofErr w:type="spellEnd"/>
+      </w:pPr>
     </w:p>
     <w:p>
       <w:pPr>
@@ -28386,16 +28291,6 @@
     </w:p>
     <w:p>
       <w:pPr>
-        <w:spacing w:before="27" w:line="273" w:lineRule="auto"/>
-        <w:ind w:left="298" w:right="5795"/>
-        <w:rPr>
-          <w:rFonts w:ascii="Courier New"/>
-          <w:sz w:val="17"/>
-        </w:rPr>
-      </w:pPr>
-    </w:p>
-    <w:p>
-      <w:pPr>
         <w:rPr>
           <w:b/>
           <w:sz w:val="28"/>
@@ -28441,11 +28336,6 @@
           <w:sz w:val="21"/>
         </w:rPr>
         <w:instrText xml:space="preserve"> HYPERLINK "https://github.com/yashvardhancse/stock-backtesting-platform-django-web-wpl-mini-project-finance-kinetic-observatory" </w:instrText>
-      </w:r>
-      <w:r>
-        <w:rPr>
-          <w:sz w:val="21"/>
-        </w:rPr>
       </w:r>
       <w:r>
         <w:rPr>
@@ -29231,7 +29121,6 @@
     <w:lvl w:ilvl="2">
       <w:start w:val="1"/>
       <w:numFmt w:val="none"/>
-      <w:pStyle w:val="Heading3"/>
       <w:suff w:val="nothing"/>
       <w:lvlText w:val=""/>
       <w:lvlJc w:val="left"/>

</xml_diff>